<commit_message>
J10 write-up: paper 5.6 rewritten with tuned repeated serving benchmark (2x at SLO, +44% peak, cache ablation, ceiling mechanism, cost-lever framing); deck + cost-lever slide; email, README, journey entry
</commit_message>
<xml_diff>
--- a/Gisting-NeurIPS-paper.docx
+++ b/Gisting-NeurIPS-paper.docx
@@ -117,7 +117,7 @@
         <w:t>measure what the compression buys</w:t>
       </w:r>
       <w:r>
-        <w:t xml:space="preserve"> at serving time on this architecture, and we report two experiments that our own evaluation harness left unscorable. The detailed numbers and their limits are in the body; here we say only that they motivate further work rather than settle it. Because every result is a single run of small, partly reused, hand-built tasks, we present this as a development study rather than a validated benchmark, with an independent adversarial review of the whole program reconciled into it. The short version, within those limits: the method cut the tokens the model reads each turn by roughly half to two-thirds with no measured loss of task success, once session-specific values were kept out of the gist, and it added serving throughput under load; what we have not shown is that it holds on work we did not design, or why the serving gain appears.</w:t>
+        <w:t xml:space="preserve"> at serving time, first in a single replay and then in a tuned, repeated benchmark on two GPU classes, and we report two experiments that our own evaluation harness left unscorable. The detailed numbers and their limits are in the body; here we say only that they motivate further work rather than settle it. Because every result is a single run of small, partly reused, hand-built tasks, we present this as a development study rather than a validated benchmark, with an independent adversarial review of the whole program reconciled into it. The short version, within those limits: the method cut the tokens the model reads each turn by roughly half to two-thirds with no measured loss of task success, once session-specific values were kept out of the gist; in a subsequent tuned, repeated serving benchmark it let the same GPU sustain twice the request rate within a latency objective and delivered 44 percent higher peak throughput, a gain that is incremental over prefix caching and that shrinks as hardware headroom grows, which makes gisting a cost lever (a cheaper GPU with the gist matched a more expensive one on throughput per dollar) rather than a speed lever; what we have not shown is that task behaviour holds on work we did not design.</w:t>
       </w:r>
     </w:p>
     <w:p>
@@ -203,7 +203,7 @@
         <w:pStyle w:val="ListNumber"/>
       </w:pPr>
       <w:r>
-        <w:t>An architecture-aware characterisation: in one replay the serving gain was larger for throughput under concurrency than for single-request latency, consistent with an expectation of smaller decode-time savings formed from the layer mix beforehand; we do not establish the cause.</w:t>
+        <w:t>A serving benchmark on a tuned server with repeated runs and a latency objective: on a 95 GB H100-class GPU the gist sustains twice the request rate within a p95 latency objective and 44 percent higher peak throughput; the gain is incremental over prefix caching and 2 to 4 times larger without it; and it shrinks as hardware headroom grows, near zero at normal load on a 143 GB GPU, which positions gisting as a cost lever: a cheaper GPU with the gist matched a more expensive GPU without it on throughput per dollar.</w:t>
       </w:r>
     </w:p>
     <w:p>
@@ -2602,7 +2602,45 @@
         <w:t>The result to watch.</w:t>
       </w:r>
       <w:r>
-        <w:t xml:space="preserve"> For a self-hosted agent that serves many developers from one GPU pool, the number that decides cost is how many sessions a GPU can carry at once, not how quickly a single reply returns. That is where gisting helps here: because each turn reads roughly half to two-thirds fewer input tokens, throughput rises under load, and the gain grows with concurrency, reaching about 16 percent more requests per minute at eight concurrent sessions. It does not make an individual reply meaningfully faster. The payoff is capacity, and it compounds exactly when the service is busiest, subject to the single-run caveats below.</w:t>
+        <w:t xml:space="preserve"> For a self-hosted agent that serves many developers from one GPU pool, the number that decides cost is how many sessions a GPU can carry at once within an acceptable latency, not how quickly a single reply returns. In a tuned, repeated benchmark on the paper’s hardware class, the gist let the same GPU sustain </w:t>
+      </w:r>
+      <w:r>
+        <w:rPr>
+          <w:b/>
+        </w:rPr>
+        <w:t>twice the request rate</w:t>
+      </w:r>
+      <w:r>
+        <w:t xml:space="preserve"> within a p95 latency objective (about 18 to 36 requests per minute) and delivered </w:t>
+      </w:r>
+      <w:r>
+        <w:rPr>
+          <w:b/>
+        </w:rPr>
+        <w:t>44 percent higher peak throughput</w:t>
+      </w:r>
+      <w:r>
+        <w:t xml:space="preserve"> (42.7 to 61.3 requests per minute). The gain is incremental over prefix caching, and 2 to 4.4 times larger when caching cannot help. It is not a speed lever: a single reply is barely faster, and on a larger GPU with memory to spare the peak gain disappears at normal load. It is a </w:t>
+      </w:r>
+      <w:r>
+        <w:rPr>
+          <w:b/>
+        </w:rPr>
+        <w:t>cost lever</w:t>
+      </w:r>
+      <w:r>
+        <w:t>: a cheaper GPU running the gist matched a more expensive GPU running the full prompt on throughput per dollar.</w:t>
+      </w:r>
+    </w:p>
+    <w:p>
+      <w:r>
+        <w:rPr>
+          <w:b/>
+        </w:rPr>
+        <w:t>Benchmark.</w:t>
+      </w:r>
+      <w:r>
+        <w:t xml:space="preserve"> A first fixed-concurrency replay on the paper’s original server configuration (131k context, 64 sequences, 0.80 memory utilisation, 4k batched tokens) showed the gist 12 to 16 percent ahead at eight concurrent sessions. Because that configuration throttles the server, we then ran a dedicated benchmark. The vLLM configuration was tuned by throughput at fixed load (context sized to the workload at 40,960 tokens, 256 sequences, 0.92 utilisation, 16k batched tokens) and applied identically to both arms. The workload is 198 turn-ordered requests per arm from 24 logged sessions (median full prompt 26,169 tokens, gist 10,998), each generating exactly 200 tokens; time to first token is measured from the first content token and cross-checked against engine counters, resolving the measurement caveat of the earlier replay. Four measurements follow: a closed-loop concurrency sweep to saturation (three repeats, balanced arm order), open-loop Poisson arrivals at rising rates (two repeats), a prefix-cache ablation, and a resident-sequence probe; the sweep was repeated on an H200 NVL (143 GB) with the same configuration (two repeats). All 201 runs completed without error.</w:t>
       </w:r>
     </w:p>
     <w:p>
@@ -2612,7 +2650,7 @@
       <w:r>
         <w:drawing>
           <wp:inline xmlns:a="http://schemas.openxmlformats.org/drawingml/2006/main" xmlns:pic="http://schemas.openxmlformats.org/drawingml/2006/picture">
-            <wp:extent cx="5760720" cy="1851660"/>
+            <wp:extent cx="5760720" cy="2033195"/>
             <wp:docPr id="9" name="Picture 9"/>
             <wp:cNvGraphicFramePr>
               <a:graphicFrameLocks noChangeAspect="1"/>
@@ -2633,7 +2671,7 @@
                   <pic:spPr>
                     <a:xfrm>
                       <a:off x="0" y="0"/>
-                      <a:ext cx="5760720" cy="1851660"/>
+                      <a:ext cx="5760720" cy="2033195"/>
                     </a:xfrm>
                     <a:prstGeom prst="rect"/>
                   </pic:spPr>
@@ -2656,7 +2694,1345 @@
         <w:rPr>
           <w:sz w:val="18"/>
         </w:rPr>
-        <w:t xml:space="preserve"> Serving on one fixed-output-length replay (72 requests per arm at each concurrency), gist versus full prompt, prefix caching on in both arms: throughput, median end-to-end latency, and p90 time-to-first-token by concurrency. The throughput improvement grows with load; the concurrency-1 latency change is small. One replay; the layer-mix explanation is a hypothesis, not a validated cause or an industrial reproduction.</w:t>
+        <w:t xml:space="preserve"> Serving benchmark on the tuned server (H100 NVL 95 GB). Left: throughput against concurrent sessions for the full prompt, the 8:1 gist, and the 16:1 gist; the full prompt collapses beyond 32 sessions as its KV cache fills, the 8:1 gist peaks at 32 with 44 percent higher throughput, and 16:1 sits between. Right: p95 end-to-end latency against offered load under Poisson arrivals; within the 2x latency objective the full prompt sustains about 18 requests per minute and the gist about 36. Repeat-to-repeat spread is within marker size.</w:t>
+      </w:r>
+    </w:p>
+    <w:tbl>
+      <w:tblPr>
+        <w:tblStyle w:val="LightGrid-Accent1"/>
+        <w:tblW w:type="auto" w:w="0"/>
+        <w:jc w:val="center"/>
+        <w:tblLook w:firstColumn="1" w:firstRow="1" w:lastColumn="0" w:lastRow="0" w:noHBand="0" w:noVBand="1" w:val="04A0"/>
+      </w:tblPr>
+      <w:tblGrid>
+        <w:gridCol w:w="1440"/>
+        <w:gridCol w:w="1440"/>
+        <w:gridCol w:w="1440"/>
+        <w:gridCol w:w="1440"/>
+        <w:gridCol w:w="1440"/>
+        <w:gridCol w:w="1440"/>
+      </w:tblGrid>
+      <w:tr>
+        <w:tc>
+          <w:tcPr>
+            <w:tcW w:type="dxa" w:w="1440"/>
+          </w:tcPr>
+          <w:p>
+            <w:r/>
+            <w:r>
+              <w:rPr>
+                <w:b/>
+                <w:sz w:val="17"/>
+              </w:rPr>
+              <w:t>Sessions</w:t>
+            </w:r>
+          </w:p>
+        </w:tc>
+        <w:tc>
+          <w:tcPr>
+            <w:tcW w:type="dxa" w:w="1440"/>
+          </w:tcPr>
+          <w:p>
+            <w:r/>
+            <w:r>
+              <w:rPr>
+                <w:b/>
+                <w:sz w:val="17"/>
+              </w:rPr>
+              <w:t>Full (req/min)</w:t>
+            </w:r>
+          </w:p>
+        </w:tc>
+        <w:tc>
+          <w:tcPr>
+            <w:tcW w:type="dxa" w:w="1440"/>
+          </w:tcPr>
+          <w:p>
+            <w:r/>
+            <w:r>
+              <w:rPr>
+                <w:b/>
+                <w:sz w:val="17"/>
+              </w:rPr>
+              <w:t>Gist 8:1</w:t>
+            </w:r>
+          </w:p>
+        </w:tc>
+        <w:tc>
+          <w:tcPr>
+            <w:tcW w:type="dxa" w:w="1440"/>
+          </w:tcPr>
+          <w:p>
+            <w:r/>
+            <w:r>
+              <w:rPr>
+                <w:b/>
+                <w:sz w:val="17"/>
+              </w:rPr>
+              <w:t>Gist 16:1</w:t>
+            </w:r>
+          </w:p>
+        </w:tc>
+        <w:tc>
+          <w:tcPr>
+            <w:tcW w:type="dxa" w:w="1440"/>
+          </w:tcPr>
+          <w:p>
+            <w:r/>
+            <w:r>
+              <w:rPr>
+                <w:b/>
+                <w:sz w:val="17"/>
+              </w:rPr>
+              <w:t>p95 E2E full</w:t>
+            </w:r>
+          </w:p>
+        </w:tc>
+        <w:tc>
+          <w:tcPr>
+            <w:tcW w:type="dxa" w:w="1440"/>
+          </w:tcPr>
+          <w:p>
+            <w:r/>
+            <w:r>
+              <w:rPr>
+                <w:b/>
+                <w:sz w:val="17"/>
+              </w:rPr>
+              <w:t>p95 E2E gist 8:1</w:t>
+            </w:r>
+          </w:p>
+        </w:tc>
+      </w:tr>
+      <w:tr>
+        <w:tc>
+          <w:tcPr>
+            <w:tcW w:type="dxa" w:w="1440"/>
+          </w:tcPr>
+          <w:p>
+            <w:r/>
+            <w:r>
+              <w:rPr>
+                <w:sz w:val="17"/>
+              </w:rPr>
+              <w:t>1</w:t>
+            </w:r>
+          </w:p>
+        </w:tc>
+        <w:tc>
+          <w:tcPr>
+            <w:tcW w:type="dxa" w:w="1440"/>
+          </w:tcPr>
+          <w:p>
+            <w:r/>
+            <w:r>
+              <w:rPr>
+                <w:sz w:val="17"/>
+              </w:rPr>
+              <w:t>13.1</w:t>
+            </w:r>
+          </w:p>
+        </w:tc>
+        <w:tc>
+          <w:tcPr>
+            <w:tcW w:type="dxa" w:w="1440"/>
+          </w:tcPr>
+          <w:p>
+            <w:r/>
+            <w:r>
+              <w:rPr>
+                <w:sz w:val="17"/>
+              </w:rPr>
+              <w:t>14.7</w:t>
+            </w:r>
+          </w:p>
+        </w:tc>
+        <w:tc>
+          <w:tcPr>
+            <w:tcW w:type="dxa" w:w="1440"/>
+          </w:tcPr>
+          <w:p>
+            <w:r/>
+            <w:r>
+              <w:rPr>
+                <w:sz w:val="17"/>
+              </w:rPr>
+              <w:t>14.0</w:t>
+            </w:r>
+          </w:p>
+        </w:tc>
+        <w:tc>
+          <w:tcPr>
+            <w:tcW w:type="dxa" w:w="1440"/>
+          </w:tcPr>
+          <w:p>
+            <w:r/>
+            <w:r>
+              <w:rPr>
+                <w:sz w:val="17"/>
+              </w:rPr>
+              <w:t>5.9 s</w:t>
+            </w:r>
+          </w:p>
+        </w:tc>
+        <w:tc>
+          <w:tcPr>
+            <w:tcW w:type="dxa" w:w="1440"/>
+          </w:tcPr>
+          <w:p>
+            <w:r/>
+            <w:r>
+              <w:rPr>
+                <w:sz w:val="17"/>
+              </w:rPr>
+              <w:t>5.2 s</w:t>
+            </w:r>
+          </w:p>
+        </w:tc>
+      </w:tr>
+      <w:tr>
+        <w:tc>
+          <w:tcPr>
+            <w:tcW w:type="dxa" w:w="1440"/>
+          </w:tcPr>
+          <w:p>
+            <w:r/>
+            <w:r>
+              <w:rPr>
+                <w:sz w:val="17"/>
+              </w:rPr>
+              <w:t>2</w:t>
+            </w:r>
+          </w:p>
+        </w:tc>
+        <w:tc>
+          <w:tcPr>
+            <w:tcW w:type="dxa" w:w="1440"/>
+          </w:tcPr>
+          <w:p>
+            <w:r/>
+            <w:r>
+              <w:rPr>
+                <w:sz w:val="17"/>
+              </w:rPr>
+              <w:t>22.7</w:t>
+            </w:r>
+          </w:p>
+        </w:tc>
+        <w:tc>
+          <w:tcPr>
+            <w:tcW w:type="dxa" w:w="1440"/>
+          </w:tcPr>
+          <w:p>
+            <w:r/>
+            <w:r>
+              <w:rPr>
+                <w:sz w:val="17"/>
+              </w:rPr>
+              <w:t>25.3</w:t>
+            </w:r>
+          </w:p>
+        </w:tc>
+        <w:tc>
+          <w:tcPr>
+            <w:tcW w:type="dxa" w:w="1440"/>
+          </w:tcPr>
+          <w:p>
+            <w:r/>
+            <w:r>
+              <w:rPr>
+                <w:sz w:val="17"/>
+              </w:rPr>
+              <w:t>24.0</w:t>
+            </w:r>
+          </w:p>
+        </w:tc>
+        <w:tc>
+          <w:tcPr>
+            <w:tcW w:type="dxa" w:w="1440"/>
+          </w:tcPr>
+          <w:p>
+            <w:r/>
+            <w:r>
+              <w:rPr>
+                <w:sz w:val="17"/>
+              </w:rPr>
+              <w:t>7.1 s</w:t>
+            </w:r>
+          </w:p>
+        </w:tc>
+        <w:tc>
+          <w:tcPr>
+            <w:tcW w:type="dxa" w:w="1440"/>
+          </w:tcPr>
+          <w:p>
+            <w:r/>
+            <w:r>
+              <w:rPr>
+                <w:sz w:val="17"/>
+              </w:rPr>
+              <w:t>6.6 s</w:t>
+            </w:r>
+          </w:p>
+        </w:tc>
+      </w:tr>
+      <w:tr>
+        <w:tc>
+          <w:tcPr>
+            <w:tcW w:type="dxa" w:w="1440"/>
+          </w:tcPr>
+          <w:p>
+            <w:r/>
+            <w:r>
+              <w:rPr>
+                <w:sz w:val="17"/>
+              </w:rPr>
+              <w:t>4</w:t>
+            </w:r>
+          </w:p>
+        </w:tc>
+        <w:tc>
+          <w:tcPr>
+            <w:tcW w:type="dxa" w:w="1440"/>
+          </w:tcPr>
+          <w:p>
+            <w:r/>
+            <w:r>
+              <w:rPr>
+                <w:sz w:val="17"/>
+              </w:rPr>
+              <w:t>36.9</w:t>
+            </w:r>
+          </w:p>
+        </w:tc>
+        <w:tc>
+          <w:tcPr>
+            <w:tcW w:type="dxa" w:w="1440"/>
+          </w:tcPr>
+          <w:p>
+            <w:r/>
+            <w:r>
+              <w:rPr>
+                <w:sz w:val="17"/>
+              </w:rPr>
+              <w:t>42.7</w:t>
+            </w:r>
+          </w:p>
+        </w:tc>
+        <w:tc>
+          <w:tcPr>
+            <w:tcW w:type="dxa" w:w="1440"/>
+          </w:tcPr>
+          <w:p>
+            <w:r/>
+            <w:r>
+              <w:rPr>
+                <w:sz w:val="17"/>
+              </w:rPr>
+              <w:t>40.0</w:t>
+            </w:r>
+          </w:p>
+        </w:tc>
+        <w:tc>
+          <w:tcPr>
+            <w:tcW w:type="dxa" w:w="1440"/>
+          </w:tcPr>
+          <w:p>
+            <w:r/>
+            <w:r>
+              <w:rPr>
+                <w:sz w:val="17"/>
+              </w:rPr>
+              <w:t>10.8 s</w:t>
+            </w:r>
+          </w:p>
+        </w:tc>
+        <w:tc>
+          <w:tcPr>
+            <w:tcW w:type="dxa" w:w="1440"/>
+          </w:tcPr>
+          <w:p>
+            <w:r/>
+            <w:r>
+              <w:rPr>
+                <w:sz w:val="17"/>
+              </w:rPr>
+              <w:t>10.1 s</w:t>
+            </w:r>
+          </w:p>
+        </w:tc>
+      </w:tr>
+      <w:tr>
+        <w:tc>
+          <w:tcPr>
+            <w:tcW w:type="dxa" w:w="1440"/>
+          </w:tcPr>
+          <w:p>
+            <w:r/>
+            <w:r>
+              <w:rPr>
+                <w:sz w:val="17"/>
+              </w:rPr>
+              <w:t>8</w:t>
+            </w:r>
+          </w:p>
+        </w:tc>
+        <w:tc>
+          <w:tcPr>
+            <w:tcW w:type="dxa" w:w="1440"/>
+          </w:tcPr>
+          <w:p>
+            <w:r/>
+            <w:r>
+              <w:rPr>
+                <w:sz w:val="17"/>
+              </w:rPr>
+              <w:t>34.7</w:t>
+            </w:r>
+          </w:p>
+        </w:tc>
+        <w:tc>
+          <w:tcPr>
+            <w:tcW w:type="dxa" w:w="1440"/>
+          </w:tcPr>
+          <w:p>
+            <w:r/>
+            <w:r>
+              <w:rPr>
+                <w:sz w:val="17"/>
+              </w:rPr>
+              <w:t>48.0</w:t>
+            </w:r>
+          </w:p>
+        </w:tc>
+        <w:tc>
+          <w:tcPr>
+            <w:tcW w:type="dxa" w:w="1440"/>
+          </w:tcPr>
+          <w:p>
+            <w:r/>
+            <w:r>
+              <w:rPr>
+                <w:sz w:val="17"/>
+              </w:rPr>
+              <w:t>42.7</w:t>
+            </w:r>
+          </w:p>
+        </w:tc>
+        <w:tc>
+          <w:tcPr>
+            <w:tcW w:type="dxa" w:w="1440"/>
+          </w:tcPr>
+          <w:p>
+            <w:r/>
+            <w:r>
+              <w:rPr>
+                <w:sz w:val="17"/>
+              </w:rPr>
+              <w:t>15.9 s</w:t>
+            </w:r>
+          </w:p>
+        </w:tc>
+        <w:tc>
+          <w:tcPr>
+            <w:tcW w:type="dxa" w:w="1440"/>
+          </w:tcPr>
+          <w:p>
+            <w:r/>
+            <w:r>
+              <w:rPr>
+                <w:sz w:val="17"/>
+              </w:rPr>
+              <w:t>13.0 s</w:t>
+            </w:r>
+          </w:p>
+        </w:tc>
+      </w:tr>
+      <w:tr>
+        <w:tc>
+          <w:tcPr>
+            <w:tcW w:type="dxa" w:w="1440"/>
+          </w:tcPr>
+          <w:p>
+            <w:r/>
+            <w:r>
+              <w:rPr>
+                <w:sz w:val="17"/>
+              </w:rPr>
+              <w:t>16</w:t>
+            </w:r>
+          </w:p>
+        </w:tc>
+        <w:tc>
+          <w:tcPr>
+            <w:tcW w:type="dxa" w:w="1440"/>
+          </w:tcPr>
+          <w:p>
+            <w:r/>
+            <w:r>
+              <w:rPr>
+                <w:sz w:val="17"/>
+              </w:rPr>
+              <w:t>42.7</w:t>
+            </w:r>
+          </w:p>
+        </w:tc>
+        <w:tc>
+          <w:tcPr>
+            <w:tcW w:type="dxa" w:w="1440"/>
+          </w:tcPr>
+          <w:p>
+            <w:r/>
+            <w:r>
+              <w:rPr>
+                <w:sz w:val="17"/>
+              </w:rPr>
+              <w:t>59.3</w:t>
+            </w:r>
+          </w:p>
+        </w:tc>
+        <w:tc>
+          <w:tcPr>
+            <w:tcW w:type="dxa" w:w="1440"/>
+          </w:tcPr>
+          <w:p>
+            <w:r/>
+            <w:r>
+              <w:rPr>
+                <w:sz w:val="17"/>
+              </w:rPr>
+              <w:t>53.3</w:t>
+            </w:r>
+          </w:p>
+        </w:tc>
+        <w:tc>
+          <w:tcPr>
+            <w:tcW w:type="dxa" w:w="1440"/>
+          </w:tcPr>
+          <w:p>
+            <w:r/>
+            <w:r>
+              <w:rPr>
+                <w:sz w:val="17"/>
+              </w:rPr>
+              <w:t>27.5 s</w:t>
+            </w:r>
+          </w:p>
+        </w:tc>
+        <w:tc>
+          <w:tcPr>
+            <w:tcW w:type="dxa" w:w="1440"/>
+          </w:tcPr>
+          <w:p>
+            <w:r/>
+            <w:r>
+              <w:rPr>
+                <w:sz w:val="17"/>
+              </w:rPr>
+              <w:t>23.0 s</w:t>
+            </w:r>
+          </w:p>
+        </w:tc>
+      </w:tr>
+      <w:tr>
+        <w:tc>
+          <w:tcPr>
+            <w:tcW w:type="dxa" w:w="1440"/>
+          </w:tcPr>
+          <w:p>
+            <w:r/>
+            <w:r>
+              <w:rPr>
+                <w:sz w:val="17"/>
+              </w:rPr>
+              <w:t>32</w:t>
+            </w:r>
+          </w:p>
+        </w:tc>
+        <w:tc>
+          <w:tcPr>
+            <w:tcW w:type="dxa" w:w="1440"/>
+          </w:tcPr>
+          <w:p>
+            <w:r/>
+            <w:r>
+              <w:rPr>
+                <w:sz w:val="17"/>
+              </w:rPr>
+              <w:t>42.7</w:t>
+            </w:r>
+          </w:p>
+        </w:tc>
+        <w:tc>
+          <w:tcPr>
+            <w:tcW w:type="dxa" w:w="1440"/>
+          </w:tcPr>
+          <w:p>
+            <w:r/>
+            <w:r>
+              <w:rPr>
+                <w:sz w:val="17"/>
+              </w:rPr>
+              <w:t>61.3</w:t>
+            </w:r>
+          </w:p>
+        </w:tc>
+        <w:tc>
+          <w:tcPr>
+            <w:tcW w:type="dxa" w:w="1440"/>
+          </w:tcPr>
+          <w:p>
+            <w:r/>
+            <w:r>
+              <w:rPr>
+                <w:sz w:val="17"/>
+              </w:rPr>
+              <w:t>54.0</w:t>
+            </w:r>
+          </w:p>
+        </w:tc>
+        <w:tc>
+          <w:tcPr>
+            <w:tcW w:type="dxa" w:w="1440"/>
+          </w:tcPr>
+          <w:p>
+            <w:r/>
+            <w:r>
+              <w:rPr>
+                <w:sz w:val="17"/>
+              </w:rPr>
+              <w:t>38.1 s</w:t>
+            </w:r>
+          </w:p>
+        </w:tc>
+        <w:tc>
+          <w:tcPr>
+            <w:tcW w:type="dxa" w:w="1440"/>
+          </w:tcPr>
+          <w:p>
+            <w:r/>
+            <w:r>
+              <w:rPr>
+                <w:sz w:val="17"/>
+              </w:rPr>
+              <w:t>41.8 s</w:t>
+            </w:r>
+          </w:p>
+        </w:tc>
+      </w:tr>
+      <w:tr>
+        <w:tc>
+          <w:tcPr>
+            <w:tcW w:type="dxa" w:w="1440"/>
+          </w:tcPr>
+          <w:p>
+            <w:r/>
+            <w:r>
+              <w:rPr>
+                <w:sz w:val="17"/>
+              </w:rPr>
+              <w:t>48</w:t>
+            </w:r>
+          </w:p>
+        </w:tc>
+        <w:tc>
+          <w:tcPr>
+            <w:tcW w:type="dxa" w:w="1440"/>
+          </w:tcPr>
+          <w:p>
+            <w:r/>
+            <w:r>
+              <w:rPr>
+                <w:sz w:val="17"/>
+              </w:rPr>
+              <w:t>32.0</w:t>
+            </w:r>
+          </w:p>
+        </w:tc>
+        <w:tc>
+          <w:tcPr>
+            <w:tcW w:type="dxa" w:w="1440"/>
+          </w:tcPr>
+          <w:p>
+            <w:r/>
+            <w:r>
+              <w:rPr>
+                <w:sz w:val="17"/>
+              </w:rPr>
+              <w:t>52.7</w:t>
+            </w:r>
+          </w:p>
+        </w:tc>
+        <w:tc>
+          <w:tcPr>
+            <w:tcW w:type="dxa" w:w="1440"/>
+          </w:tcPr>
+          <w:p>
+            <w:r/>
+            <w:r>
+              <w:rPr>
+                <w:sz w:val="17"/>
+              </w:rPr>
+              <w:t>44.0</w:t>
+            </w:r>
+          </w:p>
+        </w:tc>
+        <w:tc>
+          <w:tcPr>
+            <w:tcW w:type="dxa" w:w="1440"/>
+          </w:tcPr>
+          <w:p>
+            <w:r/>
+            <w:r>
+              <w:rPr>
+                <w:sz w:val="17"/>
+              </w:rPr>
+              <w:t>52.6 s</w:t>
+            </w:r>
+          </w:p>
+        </w:tc>
+        <w:tc>
+          <w:tcPr>
+            <w:tcW w:type="dxa" w:w="1440"/>
+          </w:tcPr>
+          <w:p>
+            <w:r/>
+            <w:r>
+              <w:rPr>
+                <w:sz w:val="17"/>
+              </w:rPr>
+              <w:t>53.0 s</w:t>
+            </w:r>
+          </w:p>
+        </w:tc>
+      </w:tr>
+      <w:tr>
+        <w:tc>
+          <w:tcPr>
+            <w:tcW w:type="dxa" w:w="1440"/>
+          </w:tcPr>
+          <w:p>
+            <w:r/>
+            <w:r>
+              <w:rPr>
+                <w:sz w:val="17"/>
+              </w:rPr>
+              <w:t>64</w:t>
+            </w:r>
+          </w:p>
+        </w:tc>
+        <w:tc>
+          <w:tcPr>
+            <w:tcW w:type="dxa" w:w="1440"/>
+          </w:tcPr>
+          <w:p>
+            <w:r/>
+            <w:r>
+              <w:rPr>
+                <w:sz w:val="17"/>
+              </w:rPr>
+              <w:t>29.3</w:t>
+            </w:r>
+          </w:p>
+        </w:tc>
+        <w:tc>
+          <w:tcPr>
+            <w:tcW w:type="dxa" w:w="1440"/>
+          </w:tcPr>
+          <w:p>
+            <w:r/>
+            <w:r>
+              <w:rPr>
+                <w:sz w:val="17"/>
+              </w:rPr>
+              <w:t>41.3</w:t>
+            </w:r>
+          </w:p>
+        </w:tc>
+        <w:tc>
+          <w:tcPr>
+            <w:tcW w:type="dxa" w:w="1440"/>
+          </w:tcPr>
+          <w:p>
+            <w:r/>
+            <w:r>
+              <w:rPr>
+                <w:sz w:val="17"/>
+              </w:rPr>
+              <w:t>36.7</w:t>
+            </w:r>
+          </w:p>
+        </w:tc>
+        <w:tc>
+          <w:tcPr>
+            <w:tcW w:type="dxa" w:w="1440"/>
+          </w:tcPr>
+          <w:p>
+            <w:r/>
+            <w:r>
+              <w:rPr>
+                <w:sz w:val="17"/>
+              </w:rPr>
+              <w:t>76.2 s</w:t>
+            </w:r>
+          </w:p>
+        </w:tc>
+        <w:tc>
+          <w:tcPr>
+            <w:tcW w:type="dxa" w:w="1440"/>
+          </w:tcPr>
+          <w:p>
+            <w:r/>
+            <w:r>
+              <w:rPr>
+                <w:sz w:val="17"/>
+              </w:rPr>
+              <w:t>67.5 s</w:t>
+            </w:r>
+          </w:p>
+        </w:tc>
+      </w:tr>
+    </w:tbl>
+    <w:p>
+      <w:r>
+        <w:rPr>
+          <w:color w:val="565B62"/>
+          <w:sz w:val="18"/>
+        </w:rPr>
+        <w:t>Table 4. Closed-loop sweep on the tuned server, mean of three repeats (two for 16:1); repeat-to-repeat standard deviation is at most 0.6 requests per minute at every point shown. Peak throughput: full prompt 42.7 at 16 sessions, 8:1 gist 61.3 at 32 (+44 percent), 16:1 gist 54.0 at 32 (+27 percent). Beyond 32 sessions the full prompt’s KV cache is full and its throughput falls to 29; the gist’s decline begins at 64. Sessions within a p95 objective of 2x, 3x, or 4x the unloaded median are quantised by the powers-of-two ladder and tie between arms (2, 4, 8); at 6x the gist holds 16 to the full prompt’s 8. The open-loop measurement (Table 5) resolves the objective without that quantisation.</w:t>
+      </w:r>
+    </w:p>
+    <w:tbl>
+      <w:tblPr>
+        <w:tblStyle w:val="LightGrid-Accent1"/>
+        <w:tblW w:type="auto" w:w="0"/>
+        <w:jc w:val="center"/>
+        <w:tblLook w:firstColumn="1" w:firstRow="1" w:lastColumn="0" w:lastRow="0" w:noHBand="0" w:noVBand="1" w:val="04A0"/>
+      </w:tblPr>
+      <w:tblGrid>
+        <w:gridCol w:w="1728"/>
+        <w:gridCol w:w="1728"/>
+        <w:gridCol w:w="1728"/>
+        <w:gridCol w:w="1728"/>
+        <w:gridCol w:w="1728"/>
+      </w:tblGrid>
+      <w:tr>
+        <w:tc>
+          <w:tcPr>
+            <w:tcW w:type="dxa" w:w="1728"/>
+          </w:tcPr>
+          <w:p>
+            <w:r/>
+            <w:r>
+              <w:rPr>
+                <w:b/>
+                <w:sz w:val="17"/>
+              </w:rPr>
+              <w:t>Offered load (req/min)</w:t>
+            </w:r>
+          </w:p>
+        </w:tc>
+        <w:tc>
+          <w:tcPr>
+            <w:tcW w:type="dxa" w:w="1728"/>
+          </w:tcPr>
+          <w:p>
+            <w:r/>
+            <w:r>
+              <w:rPr>
+                <w:b/>
+                <w:sz w:val="17"/>
+              </w:rPr>
+              <w:t>p95 E2E full</w:t>
+            </w:r>
+          </w:p>
+        </w:tc>
+        <w:tc>
+          <w:tcPr>
+            <w:tcW w:type="dxa" w:w="1728"/>
+          </w:tcPr>
+          <w:p>
+            <w:r/>
+            <w:r>
+              <w:rPr>
+                <w:b/>
+                <w:sz w:val="17"/>
+              </w:rPr>
+              <w:t>Within 2x objective (8.5 s)</w:t>
+            </w:r>
+          </w:p>
+        </w:tc>
+        <w:tc>
+          <w:tcPr>
+            <w:tcW w:type="dxa" w:w="1728"/>
+          </w:tcPr>
+          <w:p>
+            <w:r/>
+            <w:r>
+              <w:rPr>
+                <w:b/>
+                <w:sz w:val="17"/>
+              </w:rPr>
+              <w:t>p95 E2E gist 8:1</w:t>
+            </w:r>
+          </w:p>
+        </w:tc>
+        <w:tc>
+          <w:tcPr>
+            <w:tcW w:type="dxa" w:w="1728"/>
+          </w:tcPr>
+          <w:p>
+            <w:r/>
+            <w:r>
+              <w:rPr>
+                <w:b/>
+                <w:sz w:val="17"/>
+              </w:rPr>
+              <w:t>Within 2x objective (8.0 s)</w:t>
+            </w:r>
+          </w:p>
+        </w:tc>
+      </w:tr>
+      <w:tr>
+        <w:tc>
+          <w:tcPr>
+            <w:tcW w:type="dxa" w:w="1728"/>
+          </w:tcPr>
+          <w:p>
+            <w:r/>
+            <w:r>
+              <w:rPr>
+                <w:sz w:val="17"/>
+              </w:rPr>
+              <w:t>9</w:t>
+            </w:r>
+          </w:p>
+        </w:tc>
+        <w:tc>
+          <w:tcPr>
+            <w:tcW w:type="dxa" w:w="1728"/>
+          </w:tcPr>
+          <w:p>
+            <w:r/>
+            <w:r>
+              <w:rPr>
+                <w:sz w:val="17"/>
+              </w:rPr>
+              <w:t>7.3 s</w:t>
+            </w:r>
+          </w:p>
+        </w:tc>
+        <w:tc>
+          <w:tcPr>
+            <w:tcW w:type="dxa" w:w="1728"/>
+          </w:tcPr>
+          <w:p>
+            <w:r/>
+            <w:r>
+              <w:rPr>
+                <w:sz w:val="17"/>
+              </w:rPr>
+              <w:t>yes</w:t>
+            </w:r>
+          </w:p>
+        </w:tc>
+        <w:tc>
+          <w:tcPr>
+            <w:tcW w:type="dxa" w:w="1728"/>
+          </w:tcPr>
+          <w:p>
+            <w:r/>
+            <w:r>
+              <w:rPr>
+                <w:sz w:val="17"/>
+              </w:rPr>
+              <w:t>5.0 s</w:t>
+            </w:r>
+          </w:p>
+        </w:tc>
+        <w:tc>
+          <w:tcPr>
+            <w:tcW w:type="dxa" w:w="1728"/>
+          </w:tcPr>
+          <w:p>
+            <w:r/>
+            <w:r>
+              <w:rPr>
+                <w:sz w:val="17"/>
+              </w:rPr>
+              <w:t>yes</w:t>
+            </w:r>
+          </w:p>
+        </w:tc>
+      </w:tr>
+      <w:tr>
+        <w:tc>
+          <w:tcPr>
+            <w:tcW w:type="dxa" w:w="1728"/>
+          </w:tcPr>
+          <w:p>
+            <w:r/>
+            <w:r>
+              <w:rPr>
+                <w:sz w:val="17"/>
+              </w:rPr>
+              <w:t>18</w:t>
+            </w:r>
+          </w:p>
+        </w:tc>
+        <w:tc>
+          <w:tcPr>
+            <w:tcW w:type="dxa" w:w="1728"/>
+          </w:tcPr>
+          <w:p>
+            <w:r/>
+            <w:r>
+              <w:rPr>
+                <w:sz w:val="17"/>
+              </w:rPr>
+              <w:t>8.4 s</w:t>
+            </w:r>
+          </w:p>
+        </w:tc>
+        <w:tc>
+          <w:tcPr>
+            <w:tcW w:type="dxa" w:w="1728"/>
+          </w:tcPr>
+          <w:p>
+            <w:r/>
+            <w:r>
+              <w:rPr>
+                <w:sz w:val="17"/>
+              </w:rPr>
+              <w:t>yes</w:t>
+            </w:r>
+          </w:p>
+        </w:tc>
+        <w:tc>
+          <w:tcPr>
+            <w:tcW w:type="dxa" w:w="1728"/>
+          </w:tcPr>
+          <w:p>
+            <w:r/>
+            <w:r>
+              <w:rPr>
+                <w:sz w:val="17"/>
+              </w:rPr>
+              <w:t>6.7 s</w:t>
+            </w:r>
+          </w:p>
+        </w:tc>
+        <w:tc>
+          <w:tcPr>
+            <w:tcW w:type="dxa" w:w="1728"/>
+          </w:tcPr>
+          <w:p>
+            <w:r/>
+            <w:r>
+              <w:rPr>
+                <w:sz w:val="17"/>
+              </w:rPr>
+              <w:t>yes</w:t>
+            </w:r>
+          </w:p>
+        </w:tc>
+      </w:tr>
+      <w:tr>
+        <w:tc>
+          <w:tcPr>
+            <w:tcW w:type="dxa" w:w="1728"/>
+          </w:tcPr>
+          <w:p>
+            <w:r/>
+            <w:r>
+              <w:rPr>
+                <w:sz w:val="17"/>
+              </w:rPr>
+              <w:t>27</w:t>
+            </w:r>
+          </w:p>
+        </w:tc>
+        <w:tc>
+          <w:tcPr>
+            <w:tcW w:type="dxa" w:w="1728"/>
+          </w:tcPr>
+          <w:p>
+            <w:r/>
+            <w:r>
+              <w:rPr>
+                <w:sz w:val="17"/>
+              </w:rPr>
+              <w:t>8.7 s</w:t>
+            </w:r>
+          </w:p>
+        </w:tc>
+        <w:tc>
+          <w:tcPr>
+            <w:tcW w:type="dxa" w:w="1728"/>
+          </w:tcPr>
+          <w:p>
+            <w:r/>
+            <w:r>
+              <w:rPr>
+                <w:sz w:val="17"/>
+              </w:rPr>
+              <w:t>no</w:t>
+            </w:r>
+          </w:p>
+        </w:tc>
+        <w:tc>
+          <w:tcPr>
+            <w:tcW w:type="dxa" w:w="1728"/>
+          </w:tcPr>
+          <w:p>
+            <w:r/>
+            <w:r>
+              <w:rPr>
+                <w:sz w:val="17"/>
+              </w:rPr>
+              <w:t>6.7 s</w:t>
+            </w:r>
+          </w:p>
+        </w:tc>
+        <w:tc>
+          <w:tcPr>
+            <w:tcW w:type="dxa" w:w="1728"/>
+          </w:tcPr>
+          <w:p>
+            <w:r/>
+            <w:r>
+              <w:rPr>
+                <w:sz w:val="17"/>
+              </w:rPr>
+              <w:t>yes</w:t>
+            </w:r>
+          </w:p>
+        </w:tc>
+      </w:tr>
+      <w:tr>
+        <w:tc>
+          <w:tcPr>
+            <w:tcW w:type="dxa" w:w="1728"/>
+          </w:tcPr>
+          <w:p>
+            <w:r/>
+            <w:r>
+              <w:rPr>
+                <w:sz w:val="17"/>
+              </w:rPr>
+              <w:t>36</w:t>
+            </w:r>
+          </w:p>
+        </w:tc>
+        <w:tc>
+          <w:tcPr>
+            <w:tcW w:type="dxa" w:w="1728"/>
+          </w:tcPr>
+          <w:p>
+            <w:r/>
+            <w:r>
+              <w:rPr>
+                <w:sz w:val="17"/>
+              </w:rPr>
+              <w:t>10.4 s</w:t>
+            </w:r>
+          </w:p>
+        </w:tc>
+        <w:tc>
+          <w:tcPr>
+            <w:tcW w:type="dxa" w:w="1728"/>
+          </w:tcPr>
+          <w:p>
+            <w:r/>
+            <w:r>
+              <w:rPr>
+                <w:sz w:val="17"/>
+              </w:rPr>
+              <w:t>no</w:t>
+            </w:r>
+          </w:p>
+        </w:tc>
+        <w:tc>
+          <w:tcPr>
+            <w:tcW w:type="dxa" w:w="1728"/>
+          </w:tcPr>
+          <w:p>
+            <w:r/>
+            <w:r>
+              <w:rPr>
+                <w:sz w:val="17"/>
+              </w:rPr>
+              <w:t>7.7 s</w:t>
+            </w:r>
+          </w:p>
+        </w:tc>
+        <w:tc>
+          <w:tcPr>
+            <w:tcW w:type="dxa" w:w="1728"/>
+          </w:tcPr>
+          <w:p>
+            <w:r/>
+            <w:r>
+              <w:rPr>
+                <w:sz w:val="17"/>
+              </w:rPr>
+              <w:t>yes</w:t>
+            </w:r>
+          </w:p>
+        </w:tc>
+      </w:tr>
+      <w:tr>
+        <w:tc>
+          <w:tcPr>
+            <w:tcW w:type="dxa" w:w="1728"/>
+          </w:tcPr>
+          <w:p>
+            <w:r/>
+            <w:r>
+              <w:rPr>
+                <w:sz w:val="17"/>
+              </w:rPr>
+              <w:t>54</w:t>
+            </w:r>
+          </w:p>
+        </w:tc>
+        <w:tc>
+          <w:tcPr>
+            <w:tcW w:type="dxa" w:w="1728"/>
+          </w:tcPr>
+          <w:p>
+            <w:r/>
+            <w:r>
+              <w:rPr>
+                <w:sz w:val="17"/>
+              </w:rPr>
+              <w:t>23.4 s</w:t>
+            </w:r>
+          </w:p>
+        </w:tc>
+        <w:tc>
+          <w:tcPr>
+            <w:tcW w:type="dxa" w:w="1728"/>
+          </w:tcPr>
+          <w:p>
+            <w:r/>
+            <w:r>
+              <w:rPr>
+                <w:sz w:val="17"/>
+              </w:rPr>
+              <w:t>no</w:t>
+            </w:r>
+          </w:p>
+        </w:tc>
+        <w:tc>
+          <w:tcPr>
+            <w:tcW w:type="dxa" w:w="1728"/>
+          </w:tcPr>
+          <w:p>
+            <w:r/>
+            <w:r>
+              <w:rPr>
+                <w:sz w:val="17"/>
+              </w:rPr>
+              <w:t>16.6 s</w:t>
+            </w:r>
+          </w:p>
+        </w:tc>
+        <w:tc>
+          <w:tcPr>
+            <w:tcW w:type="dxa" w:w="1728"/>
+          </w:tcPr>
+          <w:p>
+            <w:r/>
+            <w:r>
+              <w:rPr>
+                <w:sz w:val="17"/>
+              </w:rPr>
+              <w:t>no</w:t>
+            </w:r>
+          </w:p>
+        </w:tc>
+      </w:tr>
+      <w:tr>
+        <w:tc>
+          <w:tcPr>
+            <w:tcW w:type="dxa" w:w="1728"/>
+          </w:tcPr>
+          <w:p>
+            <w:r/>
+            <w:r>
+              <w:rPr>
+                <w:sz w:val="17"/>
+              </w:rPr>
+              <w:t>72</w:t>
+            </w:r>
+          </w:p>
+        </w:tc>
+        <w:tc>
+          <w:tcPr>
+            <w:tcW w:type="dxa" w:w="1728"/>
+          </w:tcPr>
+          <w:p>
+            <w:r/>
+            <w:r>
+              <w:rPr>
+                <w:sz w:val="17"/>
+              </w:rPr>
+              <w:t>79.5 s</w:t>
+            </w:r>
+          </w:p>
+        </w:tc>
+        <w:tc>
+          <w:tcPr>
+            <w:tcW w:type="dxa" w:w="1728"/>
+          </w:tcPr>
+          <w:p>
+            <w:r/>
+            <w:r>
+              <w:rPr>
+                <w:sz w:val="17"/>
+              </w:rPr>
+              <w:t>no</w:t>
+            </w:r>
+          </w:p>
+        </w:tc>
+        <w:tc>
+          <w:tcPr>
+            <w:tcW w:type="dxa" w:w="1728"/>
+          </w:tcPr>
+          <w:p>
+            <w:r/>
+            <w:r>
+              <w:rPr>
+                <w:sz w:val="17"/>
+              </w:rPr>
+              <w:t>26.5 s</w:t>
+            </w:r>
+          </w:p>
+        </w:tc>
+        <w:tc>
+          <w:tcPr>
+            <w:tcW w:type="dxa" w:w="1728"/>
+          </w:tcPr>
+          <w:p>
+            <w:r/>
+            <w:r>
+              <w:rPr>
+                <w:sz w:val="17"/>
+              </w:rPr>
+              <w:t>no</w:t>
+            </w:r>
+          </w:p>
+        </w:tc>
+      </w:tr>
+    </w:tbl>
+    <w:p>
+      <w:r>
+        <w:rPr>
+          <w:color w:val="565B62"/>
+          <w:sz w:val="18"/>
+        </w:rPr>
+        <w:t>Table 5. Open-loop Poisson arrivals, mean of two repeats. Both arms serve the offered load; the difference is latency. With the objective set at twice each arm’s unloaded median, the full prompt stays inside it up to about 18 requests per minute and the gist up to about 36: twice the sustainable load on the same GPU.</w:t>
       </w:r>
     </w:p>
     <w:tbl>
@@ -2687,7 +4063,7 @@
                 <w:b/>
                 <w:sz w:val="17"/>
               </w:rPr>
-              <w:t>Concurrency</w:t>
+              <w:t>Sessions</w:t>
             </w:r>
           </w:p>
         </w:tc>
@@ -2702,7 +4078,7 @@
                 <w:b/>
                 <w:sz w:val="17"/>
               </w:rPr>
-              <w:t>Throughput full → gist (req/min)</w:t>
+              <w:t>Full, cache on</w:t>
             </w:r>
           </w:p>
         </w:tc>
@@ -2717,7 +4093,7 @@
                 <w:b/>
                 <w:sz w:val="17"/>
               </w:rPr>
-              <w:t>Δ</w:t>
+              <w:t>Full, cache off</w:t>
             </w:r>
           </w:p>
         </w:tc>
@@ -2732,7 +4108,7 @@
                 <w:b/>
                 <w:sz w:val="17"/>
               </w:rPr>
-              <w:t>Median E2E full → gist (s)</w:t>
+              <w:t>Gist, cache on</w:t>
             </w:r>
           </w:p>
         </w:tc>
@@ -2747,7 +4123,7 @@
                 <w:b/>
                 <w:sz w:val="17"/>
               </w:rPr>
-              <w:t>Δ</w:t>
+              <w:t>Gist, cache off</w:t>
             </w:r>
           </w:p>
         </w:tc>
@@ -2762,7 +4138,7 @@
                 <w:b/>
                 <w:sz w:val="17"/>
               </w:rPr>
-              <w:t>p90 TTFT full → gist (s)</w:t>
+              <w:t>Gist / full, cache on</w:t>
             </w:r>
           </w:p>
         </w:tc>
@@ -2777,107 +4153,7 @@
                 <w:b/>
                 <w:sz w:val="17"/>
               </w:rPr>
-              <w:t>Δ</w:t>
-            </w:r>
-          </w:p>
-        </w:tc>
-      </w:tr>
-      <w:tr>
-        <w:tc>
-          <w:tcPr>
-            <w:tcW w:type="dxa" w:w="1234"/>
-          </w:tcPr>
-          <w:p>
-            <w:r/>
-            <w:r>
-              <w:rPr>
-                <w:sz w:val="17"/>
-              </w:rPr>
-              <w:t>1</w:t>
-            </w:r>
-          </w:p>
-        </w:tc>
-        <w:tc>
-          <w:tcPr>
-            <w:tcW w:type="dxa" w:w="1234"/>
-          </w:tcPr>
-          <w:p>
-            <w:r/>
-            <w:r>
-              <w:rPr>
-                <w:sz w:val="17"/>
-              </w:rPr>
-              <w:t>6.87 → 7.19</w:t>
-            </w:r>
-          </w:p>
-        </w:tc>
-        <w:tc>
-          <w:tcPr>
-            <w:tcW w:type="dxa" w:w="1234"/>
-          </w:tcPr>
-          <w:p>
-            <w:r/>
-            <w:r>
-              <w:rPr>
-                <w:sz w:val="17"/>
-              </w:rPr>
-              <w:t>+4.7%</w:t>
-            </w:r>
-          </w:p>
-        </w:tc>
-        <w:tc>
-          <w:tcPr>
-            <w:tcW w:type="dxa" w:w="1234"/>
-          </w:tcPr>
-          <w:p>
-            <w:r/>
-            <w:r>
-              <w:rPr>
-                <w:sz w:val="17"/>
-              </w:rPr>
-              <w:t>8.23 → 7.97</w:t>
-            </w:r>
-          </w:p>
-        </w:tc>
-        <w:tc>
-          <w:tcPr>
-            <w:tcW w:type="dxa" w:w="1234"/>
-          </w:tcPr>
-          <w:p>
-            <w:r/>
-            <w:r>
-              <w:rPr>
-                <w:sz w:val="17"/>
-              </w:rPr>
-              <w:t>-3.2%</w:t>
-            </w:r>
-          </w:p>
-        </w:tc>
-        <w:tc>
-          <w:tcPr>
-            <w:tcW w:type="dxa" w:w="1234"/>
-          </w:tcPr>
-          <w:p>
-            <w:r/>
-            <w:r>
-              <w:rPr>
-                <w:sz w:val="17"/>
-              </w:rPr>
-              <w:t>2.69 → 2.37</w:t>
-            </w:r>
-          </w:p>
-        </w:tc>
-        <w:tc>
-          <w:tcPr>
-            <w:tcW w:type="dxa" w:w="1234"/>
-          </w:tcPr>
-          <w:p>
-            <w:r/>
-            <w:r>
-              <w:rPr>
-                <w:sz w:val="17"/>
-              </w:rPr>
-              <w:t>-12%</w:t>
+              <w:t>Gist / full, cache off</w:t>
             </w:r>
           </w:p>
         </w:tc>
@@ -2907,7 +4183,7 @@
               <w:rPr>
                 <w:sz w:val="17"/>
               </w:rPr>
-              <w:t>16.42 → 18.90</w:t>
+              <w:t>36.9</w:t>
             </w:r>
           </w:p>
         </w:tc>
@@ -2921,7 +4197,7 @@
               <w:rPr>
                 <w:sz w:val="17"/>
               </w:rPr>
-              <w:t>+15.2%</w:t>
+              <w:t>10.7</w:t>
             </w:r>
           </w:p>
         </w:tc>
@@ -2935,7 +4211,7 @@
               <w:rPr>
                 <w:sz w:val="17"/>
               </w:rPr>
-              <w:t>12.96 → 11.47</w:t>
+              <w:t>42.7</w:t>
             </w:r>
           </w:p>
         </w:tc>
@@ -2949,7 +4225,7 @@
               <w:rPr>
                 <w:sz w:val="17"/>
               </w:rPr>
-              <w:t>-11.5%</w:t>
+              <w:t>21.3</w:t>
             </w:r>
           </w:p>
         </w:tc>
@@ -2963,7 +4239,7 @@
               <w:rPr>
                 <w:sz w:val="17"/>
               </w:rPr>
-              <w:t>8.96 → 5.46</w:t>
+              <w:t>1.16x</w:t>
             </w:r>
           </w:p>
         </w:tc>
@@ -2977,7 +4253,7 @@
               <w:rPr>
                 <w:sz w:val="17"/>
               </w:rPr>
-              <w:t>-39%</w:t>
+              <w:t>2.00x</w:t>
             </w:r>
           </w:p>
         </w:tc>
@@ -3007,7 +4283,7 @@
               <w:rPr>
                 <w:sz w:val="17"/>
               </w:rPr>
-              <w:t>20.02 → 23.18</w:t>
+              <w:t>34.7</w:t>
             </w:r>
           </w:p>
         </w:tc>
@@ -3021,7 +4297,7 @@
               <w:rPr>
                 <w:sz w:val="17"/>
               </w:rPr>
-              <w:t>+15.8%</w:t>
+              <w:t>10.3</w:t>
             </w:r>
           </w:p>
         </w:tc>
@@ -3035,7 +4311,7 @@
               <w:rPr>
                 <w:sz w:val="17"/>
               </w:rPr>
-              <w:t>14.95 → 13.14</w:t>
+              <w:t>48.0</w:t>
             </w:r>
           </w:p>
         </w:tc>
@@ -3049,7 +4325,7 @@
               <w:rPr>
                 <w:sz w:val="17"/>
               </w:rPr>
-              <w:t>-12.1%</w:t>
+              <w:t>25.7</w:t>
             </w:r>
           </w:p>
         </w:tc>
@@ -3063,7 +4339,7 @@
               <w:rPr>
                 <w:sz w:val="17"/>
               </w:rPr>
-              <w:t>12.72 → 11.52</w:t>
+              <w:t>1.38x</w:t>
             </w:r>
           </w:p>
         </w:tc>
@@ -3077,7 +4353,107 @@
               <w:rPr>
                 <w:sz w:val="17"/>
               </w:rPr>
-              <w:t>-9%</w:t>
+              <w:t>2.48x</w:t>
+            </w:r>
+          </w:p>
+        </w:tc>
+      </w:tr>
+      <w:tr>
+        <w:tc>
+          <w:tcPr>
+            <w:tcW w:type="dxa" w:w="1234"/>
+          </w:tcPr>
+          <w:p>
+            <w:r/>
+            <w:r>
+              <w:rPr>
+                <w:sz w:val="17"/>
+              </w:rPr>
+              <w:t>16</w:t>
+            </w:r>
+          </w:p>
+        </w:tc>
+        <w:tc>
+          <w:tcPr>
+            <w:tcW w:type="dxa" w:w="1234"/>
+          </w:tcPr>
+          <w:p>
+            <w:r/>
+            <w:r>
+              <w:rPr>
+                <w:sz w:val="17"/>
+              </w:rPr>
+              <w:t>42.7</w:t>
+            </w:r>
+          </w:p>
+        </w:tc>
+        <w:tc>
+          <w:tcPr>
+            <w:tcW w:type="dxa" w:w="1234"/>
+          </w:tcPr>
+          <w:p>
+            <w:r/>
+            <w:r>
+              <w:rPr>
+                <w:sz w:val="17"/>
+              </w:rPr>
+              <w:t>6.0</w:t>
+            </w:r>
+          </w:p>
+        </w:tc>
+        <w:tc>
+          <w:tcPr>
+            <w:tcW w:type="dxa" w:w="1234"/>
+          </w:tcPr>
+          <w:p>
+            <w:r/>
+            <w:r>
+              <w:rPr>
+                <w:sz w:val="17"/>
+              </w:rPr>
+              <w:t>59.3</w:t>
+            </w:r>
+          </w:p>
+        </w:tc>
+        <w:tc>
+          <w:tcPr>
+            <w:tcW w:type="dxa" w:w="1234"/>
+          </w:tcPr>
+          <w:p>
+            <w:r/>
+            <w:r>
+              <w:rPr>
+                <w:sz w:val="17"/>
+              </w:rPr>
+              <w:t>26.3</w:t>
+            </w:r>
+          </w:p>
+        </w:tc>
+        <w:tc>
+          <w:tcPr>
+            <w:tcW w:type="dxa" w:w="1234"/>
+          </w:tcPr>
+          <w:p>
+            <w:r/>
+            <w:r>
+              <w:rPr>
+                <w:sz w:val="17"/>
+              </w:rPr>
+              <w:t>1.39x</w:t>
+            </w:r>
+          </w:p>
+        </w:tc>
+        <w:tc>
+          <w:tcPr>
+            <w:tcW w:type="dxa" w:w="1234"/>
+          </w:tcPr>
+          <w:p>
+            <w:r/>
+            <w:r>
+              <w:rPr>
+                <w:sz w:val="17"/>
+              </w:rPr>
+              <w:t>4.39x</w:t>
             </w:r>
           </w:p>
         </w:tc>
@@ -3089,12 +4465,34 @@
           <w:color w:val="565B62"/>
           <w:sz w:val="18"/>
         </w:rPr>
-        <w:t>Table 4. Serving on one fixed-output-length replay: 12 logged sessions × 6 turns = 72 requests per arm at each concurrency, 200 generated tokens, temperature zero, prefix caching on in both arms, teacher then student, ascending concurrency without cache resets. Throughput is requests completed per minute (higher is better); median E2E is end-to-end request latency; p90 TTFT is the 90th-percentile wait before the first output token (both lower is better). Percentages are computed from unrounded measurements. One replay; direction, not precision.</w:t>
+        <w:t>Table 6. Prefix-cache ablation (requests per minute), mean of two repeats; cache-on values from Table 4. Prefix caching does most of the work for the full prompt, which becomes prefill-bound without it; the gist is far less cache-dependent. The gist’s advantage is therefore incremental over caching when prefixes are shared, and grows to 2 to 4.4 times when they are not.</w:t>
       </w:r>
     </w:p>
     <w:p>
       <w:r>
-        <w:t>Throughput rose about 5, 15, and 16 percent at concurrency 1, 4, and 8, while median end-to-end latency fell about 3, 12, and 12 percent (Table 4). The single-request (concurrency-1) end-to-end change was small. The engine counters at concurrency 1 attribute the larger absolute saving to prefill (1.56 to 1.31 seconds per request) rather than decode (7.15 to 7.03), which is consistent with a smaller decode-time opportunity on a model with full attention in only 16 of 64 layers; layer counts are not runtime fractions, however, and we do not identify the cause. The industrial report’s 38 percent median end-to-end reduction was measured at 350 requests per minute on a differently specified model, so our figures are numerically similar in a different regime rather than a reproduction of a single-request result. The replay measures serving on a fixed workload, not agent task completion, and its static allocation of sessions across workers leaves an uneven drain phase; we did not run a saturation search or measure completed sessions per GPU.</w:t>
+        <w:rPr>
+          <w:b/>
+        </w:rPr>
+        <w:t>Where the capacity comes from.</w:t>
+      </w:r>
+      <w:r>
+        <w:t xml:space="preserve"> Driving both arms at 256 offered sessions, the H100 kept at most 54 full-prompt and 66 gist sequences resident with the KV cache full in both cases; the H200 kept exactly 100 resident in both arms with the KV cache only 83 percent full and no preemptions. The resident-session ceiling on this hybrid model is therefore set by the recurrent-state cache, whose per-sequence cost does not depend on prompt length, not by the KV cache the prompt occupies. The gist raises throughput mainly by faster turnover per session (about 60 percent less prefill work and lower KV pressure) and only secondarily by fitting more sessions; at the H200 ceiling it served 85.5 requests per minute to the full prompt’s 50.0 with the same 100 sequences resident. This refines the mechanism stated in the first version of this paper.</w:t>
+      </w:r>
+    </w:p>
+    <w:p>
+      <w:r>
+        <w:rPr>
+          <w:b/>
+        </w:rPr>
+        <w:t>The gain depends on hardware headroom, which makes it a cost lever.</w:t>
+      </w:r>
+      <w:r>
+        <w:t xml:space="preserve"> On the H200 NVL with the same configuration, peak throughput was 85.3 requests per minute for the full prompt and 83.3 for the gist (minus 2 percent); the gist was ahead by 4 to 16 percent at low load, behind at 16 sessions (0.81x, reproducible across both repeats and most likely because the configuration was tuned on the H100), ahead by 45 percent at 32, and 3.1 times ahead at 128 sessions where the full prompt collapsed. With more memory and bandwidth the prompt is not the binding cost at normal load, so shrinking it buys little until the server is pushed. Dividing peak throughput by each GPU class’s hourly rental price at the time of the run gives 16.2 requests per minute per dollar-hour for the full prompt on the H100, 23.2 for the gist on the H100, 22.5 for the full prompt on the H200, and 22.0 for the gist on the H200: the gist let the cheaper GPU match the more expensive one. We therefore read gisting as a cost lever whose value is proportional to how memory-constrained the hardware is relative to the prompt, and, for workloads whose prompts do not share prefixes, as a robustness lever that holds on any hardware. Extrapolating the trend, a still larger GPU would show little peak gain at normal load; that is a prediction from the mechanism, not a measurement.</w:t>
+      </w:r>
+    </w:p>
+    <w:p>
+      <w:r>
+        <w:t>The 16:1 gist delivered about two thirds of the 8:1 gain (+27 versus +44 percent peak) on an identically difficult session pool, so further compression is a loss on serving before any quality risk is considered; 8:1 remains the operating point.</w:t>
       </w:r>
     </w:p>
     <w:p>
@@ -3171,10 +4569,10 @@
         <w:rPr>
           <w:b/>
         </w:rPr>
-        <w:t>Architecture shapes, but does not determine, the benefit.</w:t>
+        <w:t>Architecture and headroom, not prompt length alone, set the benefit.</w:t>
       </w:r>
       <w:r>
-        <w:t xml:space="preserve"> Full attention runs in 16 of 64 layers, where decode does prefix-length-dependent work over a per-token cache; the other 48 fold the prefix into a fixed-size recurrent state. That supports expecting a smaller decode-time opportunity than on an otherwise comparable all-full-attention model, and the planning notes recorded that qualitative expectation before measurement. The observations are consistent with it: the concurrency-1 median end-to-end reduction was small and the throughput gain grew with load. But 16/64 is not the fraction of runtime saved, the MLP and projection costs remain, all layers still process uncached prefix tokens, and scheduling and memory behaviour matter, so we treat the layer-mix account as a hypothesis rather than an identified cause.</w:t>
+        <w:t xml:space="preserve"> Full attention runs in 16 of 64 layers; the other 48 fold the prefix into a fixed-size recurrent state. The benchmark showed the consequence directly: the resident-session ceiling is set by the recurrent-state cache, whose cost per sequence is independent of prompt length, so a shorter prompt does not let many more sessions fit; it lets each session finish sooner. That is why the measured gain is throughput and sustainable load rather than single-request latency, why it is largest where memory is tight (the 95 GB card) and smallest where it is not (the 143 GB card at normal load), and why it survives the removal of prefix caching. The layer-mix expectation recorded before measurement pointed in this direction; the benchmark supplies the mechanism.</w:t>
       </w:r>
     </w:p>
     <w:p>
@@ -3249,7 +4647,7 @@
         <w:pStyle w:val="ListBullet"/>
       </w:pPr>
       <w:r>
-        <w:t>The latency result is one fixed-output-length replay run once, ascending concurrency without cache resets; it records one observed direction, not repeatability or saturation. The harness derives time-to-first-token from the first server-sent event without confirming it carries an output token and counts events as generated tokens, a measurement risk we note rather than one we have ruled out.</w:t>
+        <w:t>The serving benchmark replays logged turns with fixed 200-token outputs on two GPU classes, three repeats on the H100 class and two on the H200; the concurrency ladder is powers of two, so sessions-within-objective is quantised (the open-loop measurement avoids this); the H200 used a configuration tuned on the H100 and showed one reproducible regression at 16 sessions, so per-hardware tuning is needed before its numbers are compared across cards; and throughput per dollar-hour uses spot rental prices on one day. Time to first token is measured from the first content token and checked against engine counters.</w:t>
       </w:r>
     </w:p>
     <w:p>
@@ -3278,7 +4676,27 @@
     </w:p>
     <w:p>
       <w:r>
-        <w:t>The method is specified in Section 3 and the setup in Section 4, and the code paths are named in the appendix. This is an outline, not a complete executable specification: full reproduction additionally requires, and we retain, the exact model and tokenizer repository and revision and the engine, driver, and CUDA versions; the original and corrected serialised spans with the tool-catalogue hash, segment boundaries, per-segment counts, and the pattern rule; per-run optimiser settings, datasets, split assignments, and train/evaluation overlap by suite; the loss equations and response-position masking; the teacher-cache format with its top-32 truncation and renormalisation (the trained objective is KL from a truncated, renormalised teacher, not the full-teacher KL); the task and checker code with score records; and the replay configuration with raw request measurements. Per-run source hashes were not captured, so the named scripts reflect their final state rather than the exact code of every historical run, and we distinguish final from historical behaviour where it differs (Section 3.4). These artefacts are retained but not distributed with this paper.</w:t>
+        <w:t xml:space="preserve">The method is specified in Section 3 and the setup in Section 4, and the code paths are named in the appendix. This is an outline, not a complete executable specification: full reproduction additionally requires, and we retain, the exact model and tokenizer repository and revision and the engine, driver, and CUDA versions; the original and corrected serialised spans with the tool-catalogue hash, segment boundaries, per-segment counts, and the pattern rule; per-run optimiser settings, datasets, split assignments, and train/evaluation overlap by suite; the loss equations and response-position masking; the teacher-cache format with its top-32 truncation and renormalisation (the trained objective is KL from a truncated, renormalised teacher, not the full-teacher KL); the task and checker code with score records; and the replay configuration with raw request measurements. Per-run source hashes were not captured, so the named scripts reflect their final state rather than the exact code of every historical run, and we distinguish final from historical behaviour where it differs (Section 3.4). The serving benchmark (load generator, corpus builder, on-box chain, per-run results, and capacity reports) is in the repository under </w:t>
+      </w:r>
+      <w:r>
+        <w:rPr>
+          <w:rFonts w:ascii="Consolas" w:hAnsi="Consolas"/>
+          <w:sz w:val="18"/>
+        </w:rPr>
+        <w:t>experiments/bench</w:t>
+      </w:r>
+      <w:r>
+        <w:t xml:space="preserve"> and </w:t>
+      </w:r>
+      <w:r>
+        <w:rPr>
+          <w:rFonts w:ascii="Consolas" w:hAnsi="Consolas"/>
+          <w:sz w:val="18"/>
+        </w:rPr>
+        <w:t>experiments/journeys/j10-bench</w:t>
+      </w:r>
+      <w:r>
+        <w:t>. The other artefacts are retained but not distributed with this paper.</w:t>
       </w:r>
     </w:p>
     <w:p>
@@ -3320,7 +4738,7 @@
     </w:p>
     <w:p>
       <w:r>
-        <w:t>A frozen-model prompt-distillation recipe can be implemented for a schema-dominated coding agent on a self-hosted hybrid model, served without modifying the client or engine, and it achieves a large reduction in input tokens per turn. In single runs on the suites we ran, a one-epoch, embedding-only gist scored equal to the full-prompt model once session-specific content was kept outside the span; whether that reflects behavioural equivalence on unseen work is untested. In one replay the serving benefit was larger for throughput than for single-request latency, consistent with the architecture but not causally established. In deployment terms the gain is extra capacity under load, not a faster individual turn. The open questions, generalisation on an untouched task set, controls that isolate the contribution of training, whether rare-tool reach is capacity-bound, a measured path-fidelity rate, and repeated serving measurements, require a rebuilt and validated evaluation harness, which our own negative results identify as the priority.</w:t>
+        <w:t>A frozen-model prompt-distillation recipe can be implemented for a schema-dominated coding agent on a self-hosted hybrid model, served without modifying the client or engine, and it achieves a large reduction in input tokens per turn. In single runs on the suites we ran, a one-epoch, embedding-only gist scored equal to the full-prompt model once session-specific content was kept outside the span; whether that reflects behavioural equivalence on unseen work is untested. A tuned, repeated serving benchmark then showed the gist sustaining twice the request rate within a latency objective and 44 percent higher peak throughput on the paper’s hardware class, incremental over prefix caching, with the resident-session ceiling set by the recurrent-state cache rather than by prompt length. The gain shrinks as hardware headroom grows, so in deployment terms gisting is a cost lever: it lets a cheaper GPU match a more expensive one on throughput per dollar, and it protects throughput where prompts do not share prefixes. The open questions, generalisation on an untouched task set, controls that isolate the contribution of training, whether rare-tool reach is capacity-bound, a measured path-fidelity rate, and per-hardware serving tuning, require a rebuilt and validated evaluation harness, which our own negative results identify as the priority.</w:t>
       </w:r>
     </w:p>
     <w:p>
@@ -3994,6 +5412,122 @@
           </w:p>
         </w:tc>
       </w:tr>
+      <w:tr>
+        <w:tc>
+          <w:tcPr>
+            <w:tcW w:type="dxa" w:w="2160"/>
+          </w:tcPr>
+          <w:p>
+            <w:r/>
+            <w:r>
+              <w:rPr>
+                <w:sz w:val="17"/>
+              </w:rPr>
+              <w:t>J10</w:t>
+            </w:r>
+          </w:p>
+        </w:tc>
+        <w:tc>
+          <w:tcPr>
+            <w:tcW w:type="dxa" w:w="2160"/>
+          </w:tcPr>
+          <w:p>
+            <w:r/>
+            <w:r>
+              <w:rPr>
+                <w:sz w:val="17"/>
+              </w:rPr>
+              <w:t>Serving benchmark, tuned server (H100 NVL)</w:t>
+            </w:r>
+          </w:p>
+        </w:tc>
+        <w:tc>
+          <w:tcPr>
+            <w:tcW w:type="dxa" w:w="2160"/>
+          </w:tcPr>
+          <w:p>
+            <w:r/>
+            <w:r>
+              <w:rPr>
+                <w:sz w:val="17"/>
+              </w:rPr>
+              <w:t>2x load within objective; +44% peak; cache ablation; ceiling probe; 16:1 arm</w:t>
+            </w:r>
+          </w:p>
+        </w:tc>
+        <w:tc>
+          <w:tcPr>
+            <w:tcW w:type="dxa" w:w="2160"/>
+          </w:tcPr>
+          <w:p>
+            <w:r/>
+            <w:r>
+              <w:rPr>
+                <w:sz w:val="17"/>
+              </w:rPr>
+              <w:t>9</w:t>
+            </w:r>
+          </w:p>
+        </w:tc>
+      </w:tr>
+      <w:tr>
+        <w:tc>
+          <w:tcPr>
+            <w:tcW w:type="dxa" w:w="2160"/>
+          </w:tcPr>
+          <w:p>
+            <w:r/>
+            <w:r>
+              <w:rPr>
+                <w:sz w:val="17"/>
+              </w:rPr>
+              <w:t>J10b</w:t>
+            </w:r>
+          </w:p>
+        </w:tc>
+        <w:tc>
+          <w:tcPr>
+            <w:tcW w:type="dxa" w:w="2160"/>
+          </w:tcPr>
+          <w:p>
+            <w:r/>
+            <w:r>
+              <w:rPr>
+                <w:sz w:val="17"/>
+              </w:rPr>
+              <w:t>Cross-hardware (H200 NVL, same config)</w:t>
+            </w:r>
+          </w:p>
+        </w:tc>
+        <w:tc>
+          <w:tcPr>
+            <w:tcW w:type="dxa" w:w="2160"/>
+          </w:tcPr>
+          <w:p>
+            <w:r/>
+            <w:r>
+              <w:rPr>
+                <w:sz w:val="17"/>
+              </w:rPr>
+              <w:t>peak -2%; 3.1x at 128 sessions; per-dollar parity with H100+gist</w:t>
+            </w:r>
+          </w:p>
+        </w:tc>
+        <w:tc>
+          <w:tcPr>
+            <w:tcW w:type="dxa" w:w="2160"/>
+          </w:tcPr>
+          <w:p>
+            <w:r/>
+            <w:r>
+              <w:rPr>
+                <w:sz w:val="17"/>
+              </w:rPr>
+              <w:t>2</w:t>
+            </w:r>
+          </w:p>
+        </w:tc>
+      </w:tr>
     </w:tbl>
     <w:p>
       <w:r>
@@ -4001,7 +5535,7 @@
           <w:color w:val="565B62"/>
           <w:sz w:val="18"/>
         </w:rPr>
-        <w:t>Table 5. All experiments and approximate GPU-hours on single 96 GB GPUs. The paper’s claims were stress-tested by an independent, model-assisted adversarial review over the frozen code, logs, and figures; its findings are reconciled into the text. The review is a check on our reporting, not an empirical validation of the method.</w:t>
+        <w:t>Table 7. All experiments and approximate GPU-hours on single 96 GB GPUs. The paper’s claims were stress-tested by an independent, model-assisted adversarial review over the frozen code, logs, and figures; its findings are reconciled into the text. The review is a check on our reporting, not an empirical validation of the method.</w:t>
       </w:r>
     </w:p>
     <w:p>

</xml_diff>